<commit_message>
Archive Madrid tours, update studio email and Hague location
</commit_message>
<xml_diff>
--- a/Read_Lockhart_Master_Professional_Artist_CV_2026.docx
+++ b/Read_Lockhart_Master_Professional_Artist_CV_2026.docx
@@ -49,7 +49,7 @@
           <w:sz w:val="18"/>
           <w:szCs w:val="18"/>
         </w:rPr>
-        <w:t xml:space="preserve">read.lockhart@gmail.com   |   readlockhart.org   |   +34 642 76 14 63   |   +1 575 224 4706</w:t>
+        <w:t xml:space="preserve">The Hague, Netherlands   |   readlockhartstudio@gmail.com   |   readlockhart.org   |   +34 642 76 14 63   |   +1 575 224 4706</w:t>
       </w:r>
     </w:p>
     <w:p>
@@ -1406,7 +1406,7 @@
           <w:sz w:val="20"/>
           <w:szCs w:val="20"/>
         </w:rPr>
-        <w:t xml:space="preserve">2025–2026 studio work in Europe through plein-air painting, work from models, small and larger-scale paintings, renewed drawing study, museum-based research, and writing projects.</w:t>
+        <w:t xml:space="preserve">Based in The Hague, Netherlands, since October 2026, following 2025–2026 studio work in Madrid. Plein-air painting, work from models, small and larger-scale paintings, renewed drawing study, museum-based research, and writing projects.</w:t>
       </w:r>
     </w:p>
     <w:p>

</xml_diff>